<commit_message>
Mon May 11 03:03:27 AM CST 2026
</commit_message>
<xml_diff>
--- a/union.publish/inst/extdata/complex.docx
+++ b/union.publish/inst/extdata/complex.docx
@@ -827,42 +827,47 @@
     </w:p>
     <w:p>
       <w:pPr>
-        <w:rPr>
-          <w:rFonts w:hint="eastAsia"/>
-        </w:rPr>
-      </w:pPr>
-      <w:r>
-        <w:rPr>
-          <w:rFonts w:hint="eastAsia"/>
-        </w:rPr>
-        <w:t>分析结果不符合预期，且疾病较为特殊，单细胞数据集目前只找到分析中的这个数据集，以及另一个相同作者的数据集，</w:t>
-      </w:r>
-      <w:r>
-        <w:t xml:space="preserve"> </w:t>
-      </w:r>
-      <w:r>
-        <w:rPr>
-          <w:rFonts w:hint="eastAsia"/>
-        </w:rPr>
-        <w:t>(GSE216748，6个样本。)</w:t>
-      </w:r>
-      <w:r>
-        <w:t xml:space="preserve"> </w:t>
-      </w:r>
-      <w:r>
-        <w:rPr>
-          <w:rFonts w:hint="eastAsia"/>
-        </w:rPr>
-        <w:t>是否需要先尝试改换该单细胞数据集来筛选关键细胞？</w:t>
-      </w:r>
-    </w:p>
-    <w:p>
-      <w:pPr>
         <w:numPr>
           <w:ilvl w:val="0"/>
           <w:numId w:val="2"/>
         </w:numPr>
-        <w:ind w:left="1134" w:leftChars="0" w:hanging="567" w:firstLineChars="0"/>
+        <w:ind w:left="420" w:leftChars="0" w:hanging="420" w:firstLineChars="0"/>
+        <w:rPr>
+          <w:rFonts w:hint="eastAsia"/>
+        </w:rPr>
+      </w:pPr>
+      <w:r>
+        <w:rPr>
+          <w:rFonts w:hint="eastAsia"/>
+        </w:rPr>
+        <w:t>分析结果不符合预期，且疾病较为特殊，单细胞数据集目前只找到分析中的这个数据集，以及另一个相同作者的数据集，</w:t>
+      </w:r>
+      <w:r>
+        <w:t xml:space="preserve"> </w:t>
+      </w:r>
+      <w:r>
+        <w:rPr>
+          <w:rFonts w:hint="eastAsia"/>
+        </w:rPr>
+        <w:t>(GSE216748，6个样本。)</w:t>
+      </w:r>
+      <w:r>
+        <w:t xml:space="preserve"> </w:t>
+      </w:r>
+      <w:r>
+        <w:rPr>
+          <w:rFonts w:hint="eastAsia"/>
+        </w:rPr>
+        <w:t>是否需要先尝试改换该单细胞数据集来筛选关键细胞？</w:t>
+      </w:r>
+    </w:p>
+    <w:p>
+      <w:pPr>
+        <w:numPr>
+          <w:ilvl w:val="2"/>
+          <w:numId w:val="3"/>
+        </w:numPr>
+        <w:ind w:left="420" w:leftChars="0" w:firstLine="1308" w:firstLineChars="0"/>
         <w:rPr>
           <w:rFonts w:hint="eastAsia"/>
         </w:rPr>
@@ -872,16 +877,161 @@
           <w:rFonts w:hint="default"/>
           <w:lang w:val="en-US"/>
         </w:rPr>
-        <w:t>asdf</w:t>
-      </w:r>
+        <w:t>asdfasd</w:t>
+      </w:r>
+    </w:p>
+    <w:p>
+      <w:pPr>
+        <w:numPr>
+          <w:ilvl w:val="2"/>
+          <w:numId w:val="4"/>
+        </w:numPr>
+        <w:ind w:left="2160" w:leftChars="0" w:hanging="432" w:firstLineChars="0"/>
+        <w:rPr>
+          <w:rFonts w:hint="eastAsia"/>
+        </w:rPr>
+      </w:pPr>
+      <w:r>
+        <w:rPr>
+          <w:rFonts w:hint="default"/>
+          <w:lang w:val="en-US"/>
+        </w:rPr>
+        <w:t>set</w:t>
+      </w:r>
+    </w:p>
+    <w:p>
+      <w:pPr>
+        <w:numPr>
+          <w:ilvl w:val="2"/>
+          <w:numId w:val="5"/>
+        </w:numPr>
+        <w:ind w:left="420" w:leftChars="0" w:firstLine="1308" w:firstLineChars="0"/>
+        <w:rPr>
+          <w:rFonts w:hint="eastAsia"/>
+        </w:rPr>
+      </w:pPr>
+      <w:r>
+        <w:rPr>
+          <w:rFonts w:hint="default"/>
+          <w:lang w:val="en-US"/>
+        </w:rPr>
+        <w:t>wedfsdf</w:t>
+      </w:r>
+    </w:p>
+    <w:p>
+      <w:pPr>
+        <w:numPr>
+          <w:ilvl w:val="2"/>
+          <w:numId w:val="2"/>
+        </w:numPr>
+        <w:ind w:left="2160" w:leftChars="0" w:hanging="432" w:firstLineChars="0"/>
+        <w:rPr>
+          <w:rFonts w:hint="eastAsia"/>
+        </w:rPr>
+      </w:pPr>
     </w:p>
     <w:p>
       <w:pPr>
         <w:numPr>
           <w:ilvl w:val="0"/>
-          <w:numId w:val="2"/>
+          <w:numId w:val="6"/>
         </w:numPr>
-        <w:ind w:left="1134" w:leftChars="0" w:hanging="567" w:firstLineChars="0"/>
+        <w:ind w:left="420" w:leftChars="0" w:hanging="420" w:firstLineChars="0"/>
+        <w:rPr>
+          <w:rFonts w:hint="eastAsia"/>
+        </w:rPr>
+      </w:pPr>
+      <w:r>
+        <w:rPr>
+          <w:rFonts w:hint="eastAsia"/>
+        </w:rPr>
+        <w:t>以及另一个相同作者的数据集，</w:t>
+      </w:r>
+      <w:r>
+        <w:t xml:space="preserve"> </w:t>
+      </w:r>
+      <w:r>
+        <w:rPr>
+          <w:rFonts w:hint="eastAsia"/>
+        </w:rPr>
+        <w:t>(GSE216748，6个样本。)</w:t>
+      </w:r>
+      <w:r>
+        <w:t xml:space="preserve"> </w:t>
+      </w:r>
+      <w:r>
+        <w:rPr>
+          <w:rFonts w:hint="eastAsia"/>
+        </w:rPr>
+        <w:t>是否试改换该细胞数据集来筛选关键细胞？</w:t>
+      </w:r>
+    </w:p>
+    <w:p>
+      <w:pPr>
+        <w:numPr>
+          <w:ilvl w:val="1"/>
+          <w:numId w:val="6"/>
+        </w:numPr>
+        <w:ind w:left="1440" w:leftChars="0" w:hanging="360" w:firstLineChars="0"/>
+        <w:rPr>
+          <w:rFonts w:hint="eastAsia"/>
+        </w:rPr>
+      </w:pPr>
+      <w:r>
+        <w:rPr>
+          <w:rFonts w:hint="default"/>
+          <w:lang w:val="en-US"/>
+        </w:rPr>
+        <w:t>sdfad</w:t>
+      </w:r>
+    </w:p>
+    <w:p>
+      <w:pPr>
+        <w:numPr>
+          <w:ilvl w:val="2"/>
+          <w:numId w:val="6"/>
+        </w:numPr>
+        <w:ind w:left="2160" w:leftChars="0" w:hanging="432" w:firstLineChars="0"/>
+        <w:rPr>
+          <w:rFonts w:hint="eastAsia"/>
+        </w:rPr>
+      </w:pPr>
+      <w:r>
+        <w:rPr>
+          <w:rFonts w:hint="default"/>
+          <w:lang w:val="en-US"/>
+        </w:rPr>
+        <w:t>sdfsdf</w:t>
+      </w:r>
+      <w:bookmarkStart w:id="14" w:name="_GoBack"/>
+      <w:bookmarkEnd w:id="14"/>
+    </w:p>
+    <w:p>
+      <w:pPr>
+        <w:numPr>
+          <w:ilvl w:val="1"/>
+          <w:numId w:val="7"/>
+        </w:numPr>
+        <w:ind w:left="1440" w:leftChars="0" w:hanging="360" w:firstLineChars="0"/>
+        <w:rPr>
+          <w:rFonts w:hint="eastAsia"/>
+        </w:rPr>
+      </w:pPr>
+      <w:r>
+        <w:rPr>
+          <w:rFonts w:hint="default"/>
+          <w:lang w:val="en-US"/>
+        </w:rPr>
+        <w:t xml:space="preserve">ceshi </w:t>
+      </w:r>
+    </w:p>
+    <w:p>
+      <w:pPr>
+        <w:numPr>
+          <w:ilvl w:val="0"/>
+          <w:numId w:val="7"/>
+        </w:numPr>
+        <w:ind w:left="420" w:leftChars="0" w:hanging="420" w:firstLineChars="0"/>
         <w:rPr>
           <w:rFonts w:hint="eastAsia"/>
         </w:rPr>
@@ -1056,16 +1206,11 @@
       <w:pPr>
         <w:numPr>
           <w:ilvl w:val="0"/>
-          <w:numId w:val="3"/>
+          <w:numId w:val="8"/>
         </w:numPr>
       </w:pPr>
       <w:r>
-        <w:t>All_intersection: TEX101, G6PC1, COMP, DLGAP1-AS3, ALOXE</w:t>
-      </w:r>
-      <w:bookmarkStart w:id="14" w:name="_GoBack"/>
-      <w:bookmarkEnd w:id="14"/>
-      <w:r>
-        <w:t>3P1, IDO2, OR7D2, MT1H, LINC01502, TM4SF1-AS1, MFSD4A, SERTM2, PAEP, IGKV3-20, ZPLD1, STAC2, CXCL13, IGHJ6, HABP2, TENM2, PEBP4, SORCS1, C4BPA, RBP4, KCNK13, LRRC26, PLA2G4E, XDH, NRAP, GPX3, CST2, CST1, PGM5P3-AS1, IGKJ4, DUOXA2, GGTLC5P, HAL, ADAMTS8, DUOX1, CLEC4E, IGHG1, ABCC8, GALNT13, TAS2R1, ANGPTL1, IGKC, IGKJ1, ADGRF4, TEX15, FBXL16, HLA-DOB, SDCBP2, SCGB2A1, NTRK1, LINC02535, EDNRB, CP, PRODH, ADAMTS15, ARLNC1, S100A3, SLC6A12, IMPDH1P5, FXYD7, …</w:t>
+        <w:t>All_intersection: TEX101, G6PC1, COMP, DLGAP1-AS3, ALOXE3P1, IDO2, OR7D2, MT1H, LINC01502, TM4SF1-AS1, MFSD4A, SERTM2, PAEP, IGKV3-20, ZPLD1, STAC2, CXCL13, IGHJ6, HABP2, TENM2, PEBP4, SORCS1, C4BPA, RBP4, KCNK13, LRRC26, PLA2G4E, XDH, NRAP, GPX3, CST2, CST1, PGM5P3-AS1, IGKJ4, DUOXA2, GGTLC5P, HAL, ADAMTS8, DUOX1, CLEC4E, IGHG1, ABCC8, GALNT13, TAS2R1, ANGPTL1, IGKC, IGKJ1, ADGRF4, TEX15, FBXL16, HLA-DOB, SDCBP2, SCGB2A1, NTRK1, LINC02535, EDNRB, CP, PRODH, ADAMTS15, ARLNC1, S100A3, SLC6A12, IMPDH1P5, FXYD7, …</w:t>
       </w:r>
     </w:p>
     <w:p>
@@ -1267,7 +1412,7 @@
       <w:pPr>
         <w:numPr>
           <w:ilvl w:val="0"/>
-          <w:numId w:val="3"/>
+          <w:numId w:val="8"/>
         </w:numPr>
       </w:pPr>
       <w:r>
@@ -3173,7 +3318,7 @@
 <w:ftr xmlns:wpc="http://schemas.microsoft.com/office/word/2010/wordprocessingCanvas" xmlns:mc="http://schemas.openxmlformats.org/markup-compatibility/2006" xmlns:o="urn:schemas-microsoft-com:office:office" xmlns:r="http://schemas.openxmlformats.org/officeDocument/2006/relationships" xmlns:m="http://schemas.openxmlformats.org/officeDocument/2006/math" xmlns:v="urn:schemas-microsoft-com:vml" xmlns:wp14="http://schemas.microsoft.com/office/word/2010/wordprocessingDrawing" xmlns:wp="http://schemas.openxmlformats.org/drawingml/2006/wordprocessingDrawing" xmlns:w10="urn:schemas-microsoft-com:office:word" xmlns:w="http://schemas.openxmlformats.org/wordprocessingml/2006/main" xmlns:w14="http://schemas.microsoft.com/office/word/2010/wordml" xmlns:w15="http://schemas.microsoft.com/office/word/2012/wordml" xmlns:wpg="http://schemas.microsoft.com/office/word/2010/wordprocessingGroup" xmlns:wpi="http://schemas.microsoft.com/office/word/2010/wordprocessingInk" xmlns:wne="http://schemas.microsoft.com/office/word/2006/wordml" xmlns:wps="http://schemas.microsoft.com/office/word/2010/wordprocessingShape" xmlns:wpsCustomData="http://www.wps.cn/officeDocument/2013/wpsCustomData" mc:Ignorable="w14 w15 wp14">
   <w:p>
     <w:pPr>
-      <w:pStyle w:val="11"/>
+      <w:pStyle w:val="16"/>
     </w:pPr>
     <w:r>
       <w:rPr>
@@ -3230,7 +3375,7 @@
                       <w:txbxContent>
                         <w:p>
                           <w:pPr>
-                            <w:pStyle w:val="11"/>
+                            <w:pStyle w:val="16"/>
                             <w:rPr>
                               <w:rFonts w:hint="default" w:ascii="Times New Roman" w:hAnsi="Times New Roman" w:eastAsia="宋体" w:cs="Times New Roman"/>
                               <w:b w:val="0"/>
@@ -3303,7 +3448,7 @@
         </mc:Choice>
         <mc:Fallback>
           <w:pict>
-            <v:shape id="_x0000_s1026" o:spid="_x0000_s1026" o:spt="202" type="#_x0000_t202" style="position:absolute;left:0pt;margin-top:0pt;height:144pt;width:144pt;mso-position-horizontal:center;mso-position-horizontal-relative:margin;mso-wrap-style:none;z-index:251659264;mso-width-relative:page;mso-height-relative:page;" filled="f" stroked="f" coordsize="21600,21600" o:gfxdata="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">
+            <v:shape id="文本框 4" o:spid="_x0000_s1026" o:spt="202" type="#_x0000_t202" style="position:absolute;left:0pt;margin-top:0pt;height:144pt;width:144pt;mso-position-horizontal:center;mso-position-horizontal-relative:margin;mso-wrap-style:none;z-index:251659264;mso-width-relative:page;mso-height-relative:page;" filled="f" stroked="f" coordsize="21600,21600" o:gfxdata="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">
               <v:fill on="f" focussize="0,0"/>
               <v:stroke on="f" weight="0.5pt"/>
               <v:imagedata o:title=""/>
@@ -3312,7 +3457,7 @@
                 <w:txbxContent>
                   <w:p>
                     <w:pPr>
-                      <w:pStyle w:val="11"/>
+                      <w:pStyle w:val="16"/>
                       <w:rPr>
                         <w:rFonts w:hint="default" w:ascii="Times New Roman" w:hAnsi="Times New Roman" w:eastAsia="宋体" w:cs="Times New Roman"/>
                         <w:b w:val="0"/>
@@ -3414,7 +3559,7 @@
 <w:hdr xmlns:wpc="http://schemas.microsoft.com/office/word/2010/wordprocessingCanvas" xmlns:mc="http://schemas.openxmlformats.org/markup-compatibility/2006" xmlns:o="urn:schemas-microsoft-com:office:office" xmlns:r="http://schemas.openxmlformats.org/officeDocument/2006/relationships" xmlns:m="http://schemas.openxmlformats.org/officeDocument/2006/math" xmlns:v="urn:schemas-microsoft-com:vml" xmlns:wp14="http://schemas.microsoft.com/office/word/2010/wordprocessingDrawing" xmlns:wp="http://schemas.openxmlformats.org/drawingml/2006/wordprocessingDrawing" xmlns:w10="urn:schemas-microsoft-com:office:word" xmlns:w="http://schemas.openxmlformats.org/wordprocessingml/2006/main" xmlns:w14="http://schemas.microsoft.com/office/word/2010/wordml" xmlns:w15="http://schemas.microsoft.com/office/word/2012/wordml" xmlns:wpg="http://schemas.microsoft.com/office/word/2010/wordprocessingGroup" xmlns:wpi="http://schemas.microsoft.com/office/word/2010/wordprocessingInk" xmlns:wne="http://schemas.microsoft.com/office/word/2006/wordml" xmlns:wps="http://schemas.microsoft.com/office/word/2010/wordprocessingShape" xmlns:wpsCustomData="http://www.wps.cn/officeDocument/2013/wpsCustomData" mc:Ignorable="w14 w15 wp14">
   <w:p>
     <w:pPr>
-      <w:pStyle w:val="12"/>
+      <w:pStyle w:val="19"/>
       <w:ind w:left="0" w:leftChars="0" w:firstLine="0" w:firstLineChars="0"/>
     </w:pPr>
   </w:p>
@@ -3424,6 +3569,280 @@
 <file path=word/numbering.xml><?xml version="1.0" encoding="utf-8"?>
 <w:numbering xmlns:wpc="http://schemas.microsoft.com/office/word/2010/wordprocessingCanvas" xmlns:mc="http://schemas.openxmlformats.org/markup-compatibility/2006" xmlns:o="urn:schemas-microsoft-com:office:office" xmlns:r="http://schemas.openxmlformats.org/officeDocument/2006/relationships" xmlns:m="http://schemas.openxmlformats.org/officeDocument/2006/math" xmlns:v="urn:schemas-microsoft-com:vml" xmlns:wp14="http://schemas.microsoft.com/office/word/2010/wordprocessingDrawing" xmlns:wp="http://schemas.openxmlformats.org/drawingml/2006/wordprocessingDrawing" xmlns:w10="urn:schemas-microsoft-com:office:word" xmlns:w="http://schemas.openxmlformats.org/wordprocessingml/2006/main" xmlns:w14="http://schemas.microsoft.com/office/word/2010/wordml" xmlns:wpg="http://schemas.microsoft.com/office/word/2010/wordprocessingGroup" xmlns:wpi="http://schemas.microsoft.com/office/word/2010/wordprocessingInk" xmlns:wne="http://schemas.microsoft.com/office/word/2006/wordml" xmlns:wps="http://schemas.microsoft.com/office/word/2010/wordprocessingShape" xmlns:wpsCustomData="http://www.wps.cn/officeDocument/2013/wpsCustomData" mc:Ignorable="w14 wp14">
   <w:abstractNum w:abstractNumId="0">
+    <w:nsid w:val="B51F25E7"/>
+    <w:multiLevelType w:val="multilevel"/>
+    <w:tmpl w:val="B51F25E7"/>
+    <w:lvl w:ilvl="0" w:tentative="0">
+      <w:start w:val="0"/>
+      <w:numFmt w:val="bullet"/>
+      <w:lvlText w:val=""/>
+      <w:lvlJc w:val="left"/>
+      <w:pPr>
+        <w:tabs>
+          <w:tab w:val="left" w:pos="420"/>
+        </w:tabs>
+        <w:ind w:left="420" w:leftChars="0" w:hanging="420" w:firstLineChars="0"/>
+      </w:pPr>
+      <w:rPr>
+        <w:rFonts w:hint="default" w:ascii="Symbol" w:hAnsi="Symbol" w:cs="Symbol"/>
+      </w:rPr>
+    </w:lvl>
+    <w:lvl w:ilvl="1" w:tentative="0">
+      <w:start w:val="0"/>
+      <w:numFmt w:val="bullet"/>
+      <w:lvlText w:val="o"/>
+      <w:lvlJc w:val="left"/>
+      <w:pPr>
+        <w:tabs>
+          <w:tab w:val="left" w:pos="420"/>
+        </w:tabs>
+        <w:ind w:left="420" w:leftChars="0" w:hanging="420" w:firstLineChars="0"/>
+      </w:pPr>
+      <w:rPr>
+        <w:rFonts w:hint="default" w:ascii="Courier New" w:hAnsi="Courier New" w:cs="Courier New"/>
+      </w:rPr>
+    </w:lvl>
+    <w:lvl w:ilvl="2" w:tentative="0">
+      <w:start w:val="0"/>
+      <w:numFmt w:val="bullet"/>
+      <w:lvlText w:val=""/>
+      <w:lvlJc w:val="left"/>
+      <w:pPr>
+        <w:tabs>
+          <w:tab w:val="left" w:pos="420"/>
+        </w:tabs>
+        <w:ind w:left="420" w:leftChars="0" w:firstLine="1308" w:firstLineChars="0"/>
+      </w:pPr>
+      <w:rPr>
+        <w:rFonts w:hint="default" w:ascii="Wingdings" w:hAnsi="Wingdings" w:cs="Wingdings"/>
+      </w:rPr>
+    </w:lvl>
+    <w:lvl w:ilvl="3" w:tentative="0">
+      <w:start w:val="0"/>
+      <w:numFmt w:val="bullet"/>
+      <w:lvlText w:val=""/>
+      <w:lvlJc w:val="left"/>
+      <w:pPr>
+        <w:tabs>
+          <w:tab w:val="left" w:pos="210"/>
+        </w:tabs>
+        <w:ind w:left="2880" w:hanging="360"/>
+      </w:pPr>
+      <w:rPr>
+        <w:rFonts w:hint="default" w:ascii="Symbol" w:hAnsi="Symbol" w:cs="Symbol"/>
+      </w:rPr>
+    </w:lvl>
+    <w:lvl w:ilvl="4" w:tentative="0">
+      <w:start w:val="0"/>
+      <w:numFmt w:val="bullet"/>
+      <w:lvlText w:val="o"/>
+      <w:lvlJc w:val="left"/>
+      <w:pPr>
+        <w:tabs>
+          <w:tab w:val="left" w:pos="210"/>
+        </w:tabs>
+        <w:ind w:left="3600" w:hanging="360"/>
+      </w:pPr>
+      <w:rPr>
+        <w:rFonts w:hint="default" w:ascii="Courier New" w:hAnsi="Courier New" w:cs="Courier New"/>
+      </w:rPr>
+    </w:lvl>
+    <w:lvl w:ilvl="5" w:tentative="0">
+      <w:start w:val="0"/>
+      <w:numFmt w:val="bullet"/>
+      <w:lvlText w:val=""/>
+      <w:lvlJc w:val="left"/>
+      <w:pPr>
+        <w:tabs>
+          <w:tab w:val="left" w:pos="210"/>
+        </w:tabs>
+        <w:ind w:left="4320" w:hanging="360"/>
+      </w:pPr>
+      <w:rPr>
+        <w:rFonts w:hint="default" w:ascii="Wingdings" w:hAnsi="Wingdings" w:cs="Wingdings"/>
+      </w:rPr>
+    </w:lvl>
+    <w:lvl w:ilvl="6" w:tentative="0">
+      <w:start w:val="0"/>
+      <w:numFmt w:val="bullet"/>
+      <w:lvlText w:val=""/>
+      <w:lvlJc w:val="left"/>
+      <w:pPr>
+        <w:tabs>
+          <w:tab w:val="left" w:pos="210"/>
+        </w:tabs>
+        <w:ind w:left="5040" w:hanging="360"/>
+      </w:pPr>
+      <w:rPr>
+        <w:rFonts w:hint="default" w:ascii="Symbol" w:hAnsi="Symbol" w:cs="Symbol"/>
+      </w:rPr>
+    </w:lvl>
+    <w:lvl w:ilvl="7" w:tentative="0">
+      <w:start w:val="0"/>
+      <w:numFmt w:val="bullet"/>
+      <w:lvlText w:val="o"/>
+      <w:lvlJc w:val="left"/>
+      <w:pPr>
+        <w:tabs>
+          <w:tab w:val="left" w:pos="210"/>
+        </w:tabs>
+        <w:ind w:left="5760" w:hanging="360"/>
+      </w:pPr>
+      <w:rPr>
+        <w:rFonts w:hint="default" w:ascii="Courier New" w:hAnsi="Courier New" w:cs="Courier New"/>
+      </w:rPr>
+    </w:lvl>
+    <w:lvl w:ilvl="8" w:tentative="0">
+      <w:start w:val="0"/>
+      <w:numFmt w:val="bullet"/>
+      <w:lvlText w:val=""/>
+      <w:lvlJc w:val="left"/>
+      <w:pPr>
+        <w:ind w:left="6480" w:hanging="360"/>
+      </w:pPr>
+      <w:rPr>
+        <w:rFonts w:hint="default" w:ascii="Wingdings" w:hAnsi="Wingdings" w:cs="Wingdings"/>
+      </w:rPr>
+    </w:lvl>
+  </w:abstractNum>
+  <w:abstractNum w:abstractNumId="1">
+    <w:nsid w:val="D7BF9959"/>
+    <w:multiLevelType w:val="multilevel"/>
+    <w:tmpl w:val="D7BF9959"/>
+    <w:lvl w:ilvl="0" w:tentative="0">
+      <w:start w:val="0"/>
+      <w:numFmt w:val="bullet"/>
+      <w:lvlText w:val=""/>
+      <w:lvlJc w:val="left"/>
+      <w:pPr>
+        <w:tabs>
+          <w:tab w:val="left" w:pos="420"/>
+        </w:tabs>
+        <w:ind w:left="420" w:leftChars="0" w:hanging="420" w:firstLineChars="0"/>
+      </w:pPr>
+      <w:rPr>
+        <w:rFonts w:hint="default" w:ascii="Symbol" w:hAnsi="Symbol" w:cs="Symbol"/>
+      </w:rPr>
+    </w:lvl>
+    <w:lvl w:ilvl="1" w:tentative="0">
+      <w:start w:val="0"/>
+      <w:numFmt w:val="bullet"/>
+      <w:lvlText w:val="o"/>
+      <w:lvlJc w:val="left"/>
+      <w:pPr>
+        <w:tabs>
+          <w:tab w:val="left" w:pos="418"/>
+        </w:tabs>
+        <w:ind w:left="420" w:leftChars="0" w:hanging="420" w:firstLineChars="0"/>
+      </w:pPr>
+      <w:rPr>
+        <w:rFonts w:hint="default" w:ascii="Courier New" w:hAnsi="Courier New" w:cs="Courier New"/>
+      </w:rPr>
+    </w:lvl>
+    <w:lvl w:ilvl="2" w:tentative="0">
+      <w:start w:val="0"/>
+      <w:numFmt w:val="bullet"/>
+      <w:lvlText w:val=""/>
+      <w:lvlJc w:val="left"/>
+      <w:pPr>
+        <w:tabs>
+          <w:tab w:val="left" w:pos="420"/>
+        </w:tabs>
+        <w:ind w:left="420" w:leftChars="0" w:firstLine="1308" w:firstLineChars="0"/>
+      </w:pPr>
+      <w:rPr>
+        <w:rFonts w:hint="default" w:ascii="Wingdings" w:hAnsi="Wingdings" w:cs="Wingdings"/>
+      </w:rPr>
+    </w:lvl>
+    <w:lvl w:ilvl="3" w:tentative="0">
+      <w:start w:val="0"/>
+      <w:numFmt w:val="bullet"/>
+      <w:lvlText w:val=""/>
+      <w:lvlJc w:val="left"/>
+      <w:pPr>
+        <w:tabs>
+          <w:tab w:val="left" w:pos="210"/>
+        </w:tabs>
+        <w:ind w:left="2880" w:hanging="360"/>
+      </w:pPr>
+      <w:rPr>
+        <w:rFonts w:hint="default" w:ascii="Symbol" w:hAnsi="Symbol" w:cs="Symbol"/>
+      </w:rPr>
+    </w:lvl>
+    <w:lvl w:ilvl="4" w:tentative="0">
+      <w:start w:val="0"/>
+      <w:numFmt w:val="bullet"/>
+      <w:lvlText w:val="o"/>
+      <w:lvlJc w:val="left"/>
+      <w:pPr>
+        <w:tabs>
+          <w:tab w:val="left" w:pos="210"/>
+        </w:tabs>
+        <w:ind w:left="3600" w:hanging="360"/>
+      </w:pPr>
+      <w:rPr>
+        <w:rFonts w:hint="default" w:ascii="Courier New" w:hAnsi="Courier New" w:cs="Courier New"/>
+      </w:rPr>
+    </w:lvl>
+    <w:lvl w:ilvl="5" w:tentative="0">
+      <w:start w:val="0"/>
+      <w:numFmt w:val="bullet"/>
+      <w:lvlText w:val=""/>
+      <w:lvlJc w:val="left"/>
+      <w:pPr>
+        <w:tabs>
+          <w:tab w:val="left" w:pos="210"/>
+        </w:tabs>
+        <w:ind w:left="4320" w:hanging="360"/>
+      </w:pPr>
+      <w:rPr>
+        <w:rFonts w:hint="default" w:ascii="Wingdings" w:hAnsi="Wingdings" w:cs="Wingdings"/>
+      </w:rPr>
+    </w:lvl>
+    <w:lvl w:ilvl="6" w:tentative="0">
+      <w:start w:val="0"/>
+      <w:numFmt w:val="bullet"/>
+      <w:lvlText w:val=""/>
+      <w:lvlJc w:val="left"/>
+      <w:pPr>
+        <w:tabs>
+          <w:tab w:val="left" w:pos="210"/>
+        </w:tabs>
+        <w:ind w:left="5040" w:hanging="360"/>
+      </w:pPr>
+      <w:rPr>
+        <w:rFonts w:hint="default" w:ascii="Symbol" w:hAnsi="Symbol" w:cs="Symbol"/>
+      </w:rPr>
+    </w:lvl>
+    <w:lvl w:ilvl="7" w:tentative="0">
+      <w:start w:val="0"/>
+      <w:numFmt w:val="bullet"/>
+      <w:lvlText w:val="o"/>
+      <w:lvlJc w:val="left"/>
+      <w:pPr>
+        <w:tabs>
+          <w:tab w:val="left" w:pos="210"/>
+        </w:tabs>
+        <w:ind w:left="5760" w:hanging="360"/>
+      </w:pPr>
+      <w:rPr>
+        <w:rFonts w:hint="default" w:ascii="Courier New" w:hAnsi="Courier New" w:cs="Courier New"/>
+      </w:rPr>
+    </w:lvl>
+    <w:lvl w:ilvl="8" w:tentative="0">
+      <w:start w:val="0"/>
+      <w:numFmt w:val="bullet"/>
+      <w:lvlText w:val=""/>
+      <w:lvlJc w:val="left"/>
+      <w:pPr>
+        <w:ind w:left="6480" w:hanging="360"/>
+      </w:pPr>
+      <w:rPr>
+        <w:rFonts w:hint="default" w:ascii="Wingdings" w:hAnsi="Wingdings" w:cs="Wingdings"/>
+      </w:rPr>
+    </w:lvl>
+  </w:abstractNum>
+  <w:abstractNum w:abstractNumId="2">
     <w:nsid w:val="F47BF296"/>
     <w:multiLevelType w:val="multilevel"/>
     <w:tmpl w:val="F47BF296"/>
@@ -3561,7 +3980,422 @@
       </w:rPr>
     </w:lvl>
   </w:abstractNum>
-  <w:abstractNum w:abstractNumId="1">
+  <w:abstractNum w:abstractNumId="3">
+    <w:nsid w:val="FBFE0A9E"/>
+    <w:multiLevelType w:val="multilevel"/>
+    <w:tmpl w:val="FBFE0A9E"/>
+    <w:lvl w:ilvl="0" w:tentative="0">
+      <w:start w:val="0"/>
+      <w:numFmt w:val="bullet"/>
+      <w:lvlText w:val=""/>
+      <w:lvlJc w:val="left"/>
+      <w:pPr>
+        <w:tabs>
+          <w:tab w:val="left" w:pos="420"/>
+        </w:tabs>
+        <w:ind w:left="420" w:leftChars="0" w:hanging="420" w:firstLineChars="0"/>
+      </w:pPr>
+      <w:rPr>
+        <w:rFonts w:hint="default" w:ascii="Symbol" w:hAnsi="Symbol" w:cs="Symbol"/>
+      </w:rPr>
+    </w:lvl>
+    <w:lvl w:ilvl="1" w:tentative="0">
+      <w:start w:val="0"/>
+      <w:numFmt w:val="bullet"/>
+      <w:lvlText w:val="o"/>
+      <w:lvlJc w:val="left"/>
+      <w:pPr>
+        <w:tabs>
+          <w:tab w:val="left" w:pos="210"/>
+        </w:tabs>
+        <w:ind w:left="1440" w:leftChars="0" w:hanging="360" w:firstLineChars="0"/>
+      </w:pPr>
+      <w:rPr>
+        <w:rFonts w:hint="default" w:ascii="Courier New" w:hAnsi="Courier New" w:cs="Courier New"/>
+      </w:rPr>
+    </w:lvl>
+    <w:lvl w:ilvl="2" w:tentative="0">
+      <w:start w:val="0"/>
+      <w:numFmt w:val="bullet"/>
+      <w:lvlText w:val=""/>
+      <w:lvlJc w:val="left"/>
+      <w:pPr>
+        <w:tabs>
+          <w:tab w:val="left" w:pos="210"/>
+        </w:tabs>
+        <w:ind w:left="2160" w:leftChars="0" w:hanging="432" w:firstLineChars="0"/>
+      </w:pPr>
+      <w:rPr>
+        <w:rFonts w:hint="default" w:ascii="Wingdings" w:hAnsi="Wingdings" w:cs="Wingdings"/>
+      </w:rPr>
+    </w:lvl>
+    <w:lvl w:ilvl="3" w:tentative="0">
+      <w:start w:val="0"/>
+      <w:numFmt w:val="bullet"/>
+      <w:lvlText w:val=""/>
+      <w:lvlJc w:val="left"/>
+      <w:pPr>
+        <w:tabs>
+          <w:tab w:val="left" w:pos="210"/>
+        </w:tabs>
+        <w:ind w:left="2880" w:hanging="360"/>
+      </w:pPr>
+      <w:rPr>
+        <w:rFonts w:hint="default" w:ascii="Symbol" w:hAnsi="Symbol" w:cs="Symbol"/>
+      </w:rPr>
+    </w:lvl>
+    <w:lvl w:ilvl="4" w:tentative="0">
+      <w:start w:val="0"/>
+      <w:numFmt w:val="bullet"/>
+      <w:lvlText w:val="o"/>
+      <w:lvlJc w:val="left"/>
+      <w:pPr>
+        <w:tabs>
+          <w:tab w:val="left" w:pos="210"/>
+        </w:tabs>
+        <w:ind w:left="3600" w:hanging="360"/>
+      </w:pPr>
+      <w:rPr>
+        <w:rFonts w:hint="default" w:ascii="Courier New" w:hAnsi="Courier New" w:cs="Courier New"/>
+      </w:rPr>
+    </w:lvl>
+    <w:lvl w:ilvl="5" w:tentative="0">
+      <w:start w:val="0"/>
+      <w:numFmt w:val="bullet"/>
+      <w:lvlText w:val=""/>
+      <w:lvlJc w:val="left"/>
+      <w:pPr>
+        <w:tabs>
+          <w:tab w:val="left" w:pos="210"/>
+        </w:tabs>
+        <w:ind w:left="4320" w:hanging="360"/>
+      </w:pPr>
+      <w:rPr>
+        <w:rFonts w:hint="default" w:ascii="Wingdings" w:hAnsi="Wingdings" w:cs="Wingdings"/>
+      </w:rPr>
+    </w:lvl>
+    <w:lvl w:ilvl="6" w:tentative="0">
+      <w:start w:val="0"/>
+      <w:numFmt w:val="bullet"/>
+      <w:lvlText w:val=""/>
+      <w:lvlJc w:val="left"/>
+      <w:pPr>
+        <w:tabs>
+          <w:tab w:val="left" w:pos="210"/>
+        </w:tabs>
+        <w:ind w:left="5040" w:hanging="360"/>
+      </w:pPr>
+      <w:rPr>
+        <w:rFonts w:hint="default" w:ascii="Symbol" w:hAnsi="Symbol" w:cs="Symbol"/>
+      </w:rPr>
+    </w:lvl>
+    <w:lvl w:ilvl="7" w:tentative="0">
+      <w:start w:val="0"/>
+      <w:numFmt w:val="bullet"/>
+      <w:lvlText w:val="o"/>
+      <w:lvlJc w:val="left"/>
+      <w:pPr>
+        <w:tabs>
+          <w:tab w:val="left" w:pos="210"/>
+        </w:tabs>
+        <w:ind w:left="5760" w:hanging="360"/>
+      </w:pPr>
+      <w:rPr>
+        <w:rFonts w:hint="default" w:ascii="Courier New" w:hAnsi="Courier New" w:cs="Courier New"/>
+      </w:rPr>
+    </w:lvl>
+    <w:lvl w:ilvl="8" w:tentative="0">
+      <w:start w:val="0"/>
+      <w:numFmt w:val="bullet"/>
+      <w:lvlText w:val=""/>
+      <w:lvlJc w:val="left"/>
+      <w:pPr>
+        <w:ind w:left="6480" w:hanging="360"/>
+      </w:pPr>
+      <w:rPr>
+        <w:rFonts w:hint="default" w:ascii="Wingdings" w:hAnsi="Wingdings" w:cs="Wingdings"/>
+      </w:rPr>
+    </w:lvl>
+  </w:abstractNum>
+  <w:abstractNum w:abstractNumId="4">
+    <w:nsid w:val="FCFF4DF2"/>
+    <w:multiLevelType w:val="multilevel"/>
+    <w:tmpl w:val="FCFF4DF2"/>
+    <w:lvl w:ilvl="0" w:tentative="0">
+      <w:start w:val="0"/>
+      <w:numFmt w:val="bullet"/>
+      <w:lvlText w:val=""/>
+      <w:lvlJc w:val="left"/>
+      <w:pPr>
+        <w:tabs>
+          <w:tab w:val="left" w:pos="420"/>
+        </w:tabs>
+        <w:ind w:left="420" w:leftChars="0" w:hanging="420" w:firstLineChars="0"/>
+      </w:pPr>
+      <w:rPr>
+        <w:rFonts w:hint="default" w:ascii="Symbol" w:hAnsi="Symbol" w:cs="Symbol"/>
+      </w:rPr>
+    </w:lvl>
+    <w:lvl w:ilvl="1" w:tentative="0">
+      <w:start w:val="0"/>
+      <w:numFmt w:val="bullet"/>
+      <w:suff w:val="space"/>
+      <w:lvlText w:val="o"/>
+      <w:lvlJc w:val="left"/>
+      <w:pPr>
+        <w:tabs>
+          <w:tab w:val="left" w:pos="418"/>
+        </w:tabs>
+        <w:ind w:left="420" w:leftChars="0" w:hanging="420" w:firstLineChars="0"/>
+      </w:pPr>
+      <w:rPr>
+        <w:rFonts w:hint="default" w:ascii="Courier New" w:hAnsi="Courier New" w:cs="Courier New"/>
+      </w:rPr>
+    </w:lvl>
+    <w:lvl w:ilvl="2" w:tentative="0">
+      <w:start w:val="0"/>
+      <w:numFmt w:val="bullet"/>
+      <w:lvlText w:val=""/>
+      <w:lvlJc w:val="left"/>
+      <w:pPr>
+        <w:tabs>
+          <w:tab w:val="left" w:pos="210"/>
+        </w:tabs>
+        <w:ind w:left="2160" w:leftChars="0" w:hanging="432" w:firstLineChars="0"/>
+      </w:pPr>
+      <w:rPr>
+        <w:rFonts w:hint="default" w:ascii="Wingdings" w:hAnsi="Wingdings" w:cs="Wingdings"/>
+      </w:rPr>
+    </w:lvl>
+    <w:lvl w:ilvl="3" w:tentative="0">
+      <w:start w:val="0"/>
+      <w:numFmt w:val="bullet"/>
+      <w:lvlText w:val=""/>
+      <w:lvlJc w:val="left"/>
+      <w:pPr>
+        <w:tabs>
+          <w:tab w:val="left" w:pos="210"/>
+        </w:tabs>
+        <w:ind w:left="2880" w:hanging="360"/>
+      </w:pPr>
+      <w:rPr>
+        <w:rFonts w:hint="default" w:ascii="Symbol" w:hAnsi="Symbol" w:cs="Symbol"/>
+      </w:rPr>
+    </w:lvl>
+    <w:lvl w:ilvl="4" w:tentative="0">
+      <w:start w:val="0"/>
+      <w:numFmt w:val="bullet"/>
+      <w:lvlText w:val="o"/>
+      <w:lvlJc w:val="left"/>
+      <w:pPr>
+        <w:tabs>
+          <w:tab w:val="left" w:pos="210"/>
+        </w:tabs>
+        <w:ind w:left="3600" w:hanging="360"/>
+      </w:pPr>
+      <w:rPr>
+        <w:rFonts w:hint="default" w:ascii="Courier New" w:hAnsi="Courier New" w:cs="Courier New"/>
+      </w:rPr>
+    </w:lvl>
+    <w:lvl w:ilvl="5" w:tentative="0">
+      <w:start w:val="0"/>
+      <w:numFmt w:val="bullet"/>
+      <w:lvlText w:val=""/>
+      <w:lvlJc w:val="left"/>
+      <w:pPr>
+        <w:tabs>
+          <w:tab w:val="left" w:pos="210"/>
+        </w:tabs>
+        <w:ind w:left="4320" w:hanging="360"/>
+      </w:pPr>
+      <w:rPr>
+        <w:rFonts w:hint="default" w:ascii="Wingdings" w:hAnsi="Wingdings" w:cs="Wingdings"/>
+      </w:rPr>
+    </w:lvl>
+    <w:lvl w:ilvl="6" w:tentative="0">
+      <w:start w:val="0"/>
+      <w:numFmt w:val="bullet"/>
+      <w:lvlText w:val=""/>
+      <w:lvlJc w:val="left"/>
+      <w:pPr>
+        <w:tabs>
+          <w:tab w:val="left" w:pos="210"/>
+        </w:tabs>
+        <w:ind w:left="5040" w:hanging="360"/>
+      </w:pPr>
+      <w:rPr>
+        <w:rFonts w:hint="default" w:ascii="Symbol" w:hAnsi="Symbol" w:cs="Symbol"/>
+      </w:rPr>
+    </w:lvl>
+    <w:lvl w:ilvl="7" w:tentative="0">
+      <w:start w:val="0"/>
+      <w:numFmt w:val="bullet"/>
+      <w:lvlText w:val="o"/>
+      <w:lvlJc w:val="left"/>
+      <w:pPr>
+        <w:tabs>
+          <w:tab w:val="left" w:pos="210"/>
+        </w:tabs>
+        <w:ind w:left="5760" w:hanging="360"/>
+      </w:pPr>
+      <w:rPr>
+        <w:rFonts w:hint="default" w:ascii="Courier New" w:hAnsi="Courier New" w:cs="Courier New"/>
+      </w:rPr>
+    </w:lvl>
+    <w:lvl w:ilvl="8" w:tentative="0">
+      <w:start w:val="0"/>
+      <w:numFmt w:val="bullet"/>
+      <w:lvlText w:val=""/>
+      <w:lvlJc w:val="left"/>
+      <w:pPr>
+        <w:ind w:left="6480" w:hanging="360"/>
+      </w:pPr>
+      <w:rPr>
+        <w:rFonts w:hint="default" w:ascii="Wingdings" w:hAnsi="Wingdings" w:cs="Wingdings"/>
+      </w:rPr>
+    </w:lvl>
+  </w:abstractNum>
+  <w:abstractNum w:abstractNumId="5">
+    <w:nsid w:val="FFBB3F6E"/>
+    <w:multiLevelType w:val="multilevel"/>
+    <w:tmpl w:val="FFBB3F6E"/>
+    <w:lvl w:ilvl="0" w:tentative="0">
+      <w:start w:val="0"/>
+      <w:numFmt w:val="bullet"/>
+      <w:lvlText w:val=""/>
+      <w:lvlJc w:val="left"/>
+      <w:pPr>
+        <w:tabs>
+          <w:tab w:val="left" w:pos="420"/>
+        </w:tabs>
+        <w:ind w:left="420" w:leftChars="0" w:hanging="420" w:firstLineChars="0"/>
+      </w:pPr>
+      <w:rPr>
+        <w:rFonts w:hint="default" w:ascii="Symbol" w:hAnsi="Symbol" w:cs="Symbol"/>
+      </w:rPr>
+    </w:lvl>
+    <w:lvl w:ilvl="1" w:tentative="0">
+      <w:start w:val="0"/>
+      <w:numFmt w:val="bullet"/>
+      <w:lvlText w:val="o"/>
+      <w:lvlJc w:val="left"/>
+      <w:pPr>
+        <w:tabs>
+          <w:tab w:val="left" w:pos="210"/>
+        </w:tabs>
+        <w:ind w:left="1440" w:leftChars="0" w:hanging="360" w:firstLineChars="0"/>
+      </w:pPr>
+      <w:rPr>
+        <w:rFonts w:hint="default" w:ascii="Courier New" w:hAnsi="Courier New" w:cs="Courier New"/>
+      </w:rPr>
+    </w:lvl>
+    <w:lvl w:ilvl="2" w:tentative="0">
+      <w:start w:val="0"/>
+      <w:numFmt w:val="bullet"/>
+      <w:lvlText w:val=""/>
+      <w:lvlJc w:val="left"/>
+      <w:pPr>
+        <w:tabs>
+          <w:tab w:val="left" w:pos="210"/>
+        </w:tabs>
+        <w:ind w:left="2160" w:leftChars="0" w:hanging="432" w:firstLineChars="0"/>
+      </w:pPr>
+      <w:rPr>
+        <w:rFonts w:hint="default" w:ascii="Wingdings" w:hAnsi="Wingdings" w:cs="Wingdings"/>
+      </w:rPr>
+    </w:lvl>
+    <w:lvl w:ilvl="3" w:tentative="0">
+      <w:start w:val="0"/>
+      <w:numFmt w:val="bullet"/>
+      <w:lvlText w:val=""/>
+      <w:lvlJc w:val="left"/>
+      <w:pPr>
+        <w:tabs>
+          <w:tab w:val="left" w:pos="210"/>
+        </w:tabs>
+        <w:ind w:left="2880" w:hanging="360"/>
+      </w:pPr>
+      <w:rPr>
+        <w:rFonts w:hint="default" w:ascii="Symbol" w:hAnsi="Symbol" w:cs="Symbol"/>
+      </w:rPr>
+    </w:lvl>
+    <w:lvl w:ilvl="4" w:tentative="0">
+      <w:start w:val="0"/>
+      <w:numFmt w:val="bullet"/>
+      <w:lvlText w:val="o"/>
+      <w:lvlJc w:val="left"/>
+      <w:pPr>
+        <w:tabs>
+          <w:tab w:val="left" w:pos="210"/>
+        </w:tabs>
+        <w:ind w:left="3600" w:hanging="360"/>
+      </w:pPr>
+      <w:rPr>
+        <w:rFonts w:hint="default" w:ascii="Courier New" w:hAnsi="Courier New" w:cs="Courier New"/>
+      </w:rPr>
+    </w:lvl>
+    <w:lvl w:ilvl="5" w:tentative="0">
+      <w:start w:val="0"/>
+      <w:numFmt w:val="bullet"/>
+      <w:lvlText w:val=""/>
+      <w:lvlJc w:val="left"/>
+      <w:pPr>
+        <w:tabs>
+          <w:tab w:val="left" w:pos="210"/>
+        </w:tabs>
+        <w:ind w:left="4320" w:hanging="360"/>
+      </w:pPr>
+      <w:rPr>
+        <w:rFonts w:hint="default" w:ascii="Wingdings" w:hAnsi="Wingdings" w:cs="Wingdings"/>
+      </w:rPr>
+    </w:lvl>
+    <w:lvl w:ilvl="6" w:tentative="0">
+      <w:start w:val="0"/>
+      <w:numFmt w:val="bullet"/>
+      <w:lvlText w:val=""/>
+      <w:lvlJc w:val="left"/>
+      <w:pPr>
+        <w:tabs>
+          <w:tab w:val="left" w:pos="210"/>
+        </w:tabs>
+        <w:ind w:left="5040" w:hanging="360"/>
+      </w:pPr>
+      <w:rPr>
+        <w:rFonts w:hint="default" w:ascii="Symbol" w:hAnsi="Symbol" w:cs="Symbol"/>
+      </w:rPr>
+    </w:lvl>
+    <w:lvl w:ilvl="7" w:tentative="0">
+      <w:start w:val="0"/>
+      <w:numFmt w:val="bullet"/>
+      <w:lvlText w:val="o"/>
+      <w:lvlJc w:val="left"/>
+      <w:pPr>
+        <w:tabs>
+          <w:tab w:val="left" w:pos="210"/>
+        </w:tabs>
+        <w:ind w:left="5760" w:hanging="360"/>
+      </w:pPr>
+      <w:rPr>
+        <w:rFonts w:hint="default" w:ascii="Courier New" w:hAnsi="Courier New" w:cs="Courier New"/>
+      </w:rPr>
+    </w:lvl>
+    <w:lvl w:ilvl="8" w:tentative="0">
+      <w:start w:val="0"/>
+      <w:numFmt w:val="bullet"/>
+      <w:lvlText w:val=""/>
+      <w:lvlJc w:val="left"/>
+      <w:pPr>
+        <w:tabs>
+          <w:tab w:val="left" w:pos="0"/>
+        </w:tabs>
+        <w:ind w:left="6480" w:hanging="360"/>
+      </w:pPr>
+      <w:rPr>
+        <w:rFonts w:hint="default" w:ascii="Wingdings" w:hAnsi="Wingdings" w:cs="Wingdings"/>
+      </w:rPr>
+    </w:lvl>
+  </w:abstractNum>
+  <w:abstractNum w:abstractNumId="6">
     <w:nsid w:val="0000A991"/>
     <w:multiLevelType w:val="multilevel"/>
     <w:tmpl w:val="0000A991"/>
@@ -3674,20 +4508,137 @@
       </w:rPr>
     </w:lvl>
   </w:abstractNum>
-  <w:abstractNum w:abstractNumId="2">
-    <w:nsid w:val="77BED6F3"/>
-    <w:multiLevelType w:val="singleLevel"/>
-    <w:tmpl w:val="77BED6F3"/>
+  <w:abstractNum w:abstractNumId="7">
+    <w:nsid w:val="7EF64D36"/>
+    <w:multiLevelType w:val="multilevel"/>
+    <w:tmpl w:val="7EF64D36"/>
     <w:lvl w:ilvl="0" w:tentative="0">
-      <w:start w:val="1"/>
+      <w:start w:val="0"/>
       <w:numFmt w:val="bullet"/>
-      <w:lvlText w:val=""/>
+      <w:lvlText w:val=""/>
       <w:lvlJc w:val="left"/>
       <w:pPr>
         <w:tabs>
           <w:tab w:val="left" w:pos="420"/>
         </w:tabs>
-        <w:ind w:left="1134" w:leftChars="0" w:hanging="567" w:firstLineChars="0"/>
+        <w:ind w:left="420" w:leftChars="0" w:hanging="420" w:firstLineChars="0"/>
+      </w:pPr>
+      <w:rPr>
+        <w:rFonts w:hint="default" w:ascii="Symbol" w:hAnsi="Symbol" w:cs="Symbol"/>
+      </w:rPr>
+    </w:lvl>
+    <w:lvl w:ilvl="1" w:tentative="0">
+      <w:start w:val="0"/>
+      <w:numFmt w:val="bullet"/>
+      <w:lvlText w:val="o"/>
+      <w:lvlJc w:val="left"/>
+      <w:pPr>
+        <w:tabs>
+          <w:tab w:val="left" w:pos="420"/>
+        </w:tabs>
+        <w:ind w:left="420" w:leftChars="0" w:firstLine="660" w:firstLineChars="0"/>
+      </w:pPr>
+      <w:rPr>
+        <w:rFonts w:hint="default" w:ascii="Courier New" w:hAnsi="Courier New" w:cs="Courier New"/>
+      </w:rPr>
+    </w:lvl>
+    <w:lvl w:ilvl="2" w:tentative="0">
+      <w:start w:val="0"/>
+      <w:numFmt w:val="bullet"/>
+      <w:lvlText w:val=""/>
+      <w:lvlJc w:val="left"/>
+      <w:pPr>
+        <w:tabs>
+          <w:tab w:val="left" w:pos="210"/>
+        </w:tabs>
+        <w:ind w:left="2160" w:leftChars="0" w:hanging="432" w:firstLineChars="0"/>
+      </w:pPr>
+      <w:rPr>
+        <w:rFonts w:hint="default" w:ascii="Wingdings" w:hAnsi="Wingdings" w:cs="Wingdings"/>
+      </w:rPr>
+    </w:lvl>
+    <w:lvl w:ilvl="3" w:tentative="0">
+      <w:start w:val="0"/>
+      <w:numFmt w:val="bullet"/>
+      <w:lvlText w:val=""/>
+      <w:lvlJc w:val="left"/>
+      <w:pPr>
+        <w:tabs>
+          <w:tab w:val="left" w:pos="210"/>
+        </w:tabs>
+        <w:ind w:left="2880" w:hanging="360"/>
+      </w:pPr>
+      <w:rPr>
+        <w:rFonts w:hint="default" w:ascii="Symbol" w:hAnsi="Symbol" w:cs="Symbol"/>
+      </w:rPr>
+    </w:lvl>
+    <w:lvl w:ilvl="4" w:tentative="0">
+      <w:start w:val="0"/>
+      <w:numFmt w:val="bullet"/>
+      <w:lvlText w:val="o"/>
+      <w:lvlJc w:val="left"/>
+      <w:pPr>
+        <w:tabs>
+          <w:tab w:val="left" w:pos="210"/>
+        </w:tabs>
+        <w:ind w:left="3600" w:hanging="360"/>
+      </w:pPr>
+      <w:rPr>
+        <w:rFonts w:hint="default" w:ascii="Courier New" w:hAnsi="Courier New" w:cs="Courier New"/>
+      </w:rPr>
+    </w:lvl>
+    <w:lvl w:ilvl="5" w:tentative="0">
+      <w:start w:val="0"/>
+      <w:numFmt w:val="bullet"/>
+      <w:lvlText w:val=""/>
+      <w:lvlJc w:val="left"/>
+      <w:pPr>
+        <w:tabs>
+          <w:tab w:val="left" w:pos="210"/>
+        </w:tabs>
+        <w:ind w:left="4320" w:hanging="360"/>
+      </w:pPr>
+      <w:rPr>
+        <w:rFonts w:hint="default" w:ascii="Wingdings" w:hAnsi="Wingdings" w:cs="Wingdings"/>
+      </w:rPr>
+    </w:lvl>
+    <w:lvl w:ilvl="6" w:tentative="0">
+      <w:start w:val="0"/>
+      <w:numFmt w:val="bullet"/>
+      <w:lvlText w:val=""/>
+      <w:lvlJc w:val="left"/>
+      <w:pPr>
+        <w:tabs>
+          <w:tab w:val="left" w:pos="210"/>
+        </w:tabs>
+        <w:ind w:left="5040" w:hanging="360"/>
+      </w:pPr>
+      <w:rPr>
+        <w:rFonts w:hint="default" w:ascii="Symbol" w:hAnsi="Symbol" w:cs="Symbol"/>
+      </w:rPr>
+    </w:lvl>
+    <w:lvl w:ilvl="7" w:tentative="0">
+      <w:start w:val="0"/>
+      <w:numFmt w:val="bullet"/>
+      <w:lvlText w:val="o"/>
+      <w:lvlJc w:val="left"/>
+      <w:pPr>
+        <w:tabs>
+          <w:tab w:val="left" w:pos="210"/>
+        </w:tabs>
+        <w:ind w:left="5760" w:hanging="360"/>
+      </w:pPr>
+      <w:rPr>
+        <w:rFonts w:hint="default" w:ascii="Courier New" w:hAnsi="Courier New" w:cs="Courier New"/>
+      </w:rPr>
+    </w:lvl>
+    <w:lvl w:ilvl="8" w:tentative="0">
+      <w:start w:val="0"/>
+      <w:numFmt w:val="bullet"/>
+      <w:lvlText w:val=""/>
+      <w:lvlJc w:val="left"/>
+      <w:pPr>
+        <w:ind w:left="6480" w:hanging="360"/>
       </w:pPr>
       <w:rPr>
         <w:rFonts w:hint="default" w:ascii="Wingdings" w:hAnsi="Wingdings" w:cs="Wingdings"/>
@@ -3695,13 +4646,28 @@
     </w:lvl>
   </w:abstractNum>
   <w:num w:numId="1">
-    <w:abstractNumId w:val="0"/>
+    <w:abstractNumId w:val="2"/>
   </w:num>
   <w:num w:numId="2">
-    <w:abstractNumId w:val="2"/>
+    <w:abstractNumId w:val="7"/>
   </w:num>
   <w:num w:numId="3">
     <w:abstractNumId w:val="1"/>
+  </w:num>
+  <w:num w:numId="4">
+    <w:abstractNumId w:val="4"/>
+  </w:num>
+  <w:num w:numId="5">
+    <w:abstractNumId w:val="0"/>
+  </w:num>
+  <w:num w:numId="6">
+    <w:abstractNumId w:val="5"/>
+  </w:num>
+  <w:num w:numId="7">
+    <w:abstractNumId w:val="3"/>
+  </w:num>
+  <w:num w:numId="8">
+    <w:abstractNumId w:val="6"/>
   </w:num>
 </w:numbering>
 </file>
@@ -4014,7 +4980,7 @@
   <w:style w:type="paragraph" w:styleId="4">
     <w:name w:val="heading 2"/>
     <w:basedOn w:val="2"/>
-    <w:autoRedefine/>
+    <w:next w:val="1"/>
     <w:unhideWhenUsed/>
     <w:qFormat/>
     <w:uiPriority w:val="0"/>
@@ -4084,13 +5050,13 @@
       <w:szCs w:val="28"/>
     </w:rPr>
   </w:style>
-  <w:style w:type="character" w:default="1" w:styleId="20">
+  <w:style w:type="character" w:default="1" w:styleId="7">
     <w:name w:val="Default Paragraph Font"/>
     <w:unhideWhenUsed/>
     <w:qFormat/>
     <w:uiPriority w:val="1"/>
   </w:style>
-  <w:style w:type="table" w:default="1" w:styleId="18">
+  <w:style w:type="table" w:default="1" w:styleId="8">
     <w:name w:val="Normal Table"/>
     <w:semiHidden/>
     <w:unhideWhenUsed/>
@@ -4121,7 +5087,18 @@
       <w:sz w:val="32"/>
     </w:rPr>
   </w:style>
-  <w:style w:type="paragraph" w:styleId="7">
+  <w:style w:type="paragraph" w:styleId="9">
+    <w:name w:val="Balloon Text"/>
+    <w:basedOn w:val="1"/>
+    <w:link w:val="30"/>
+    <w:qFormat/>
+    <w:uiPriority w:val="0"/>
+    <w:rPr>
+      <w:sz w:val="18"/>
+      <w:szCs w:val="18"/>
+    </w:rPr>
+  </w:style>
+  <w:style w:type="paragraph" w:styleId="10">
     <w:name w:val="caption"/>
     <w:basedOn w:val="1"/>
     <w:next w:val="1"/>
@@ -4136,11 +5113,20 @@
       <w:szCs w:val="21"/>
     </w:rPr>
   </w:style>
-  <w:style w:type="paragraph" w:styleId="8">
+  <w:style w:type="character" w:styleId="11">
+    <w:name w:val="annotation reference"/>
+    <w:basedOn w:val="7"/>
+    <w:qFormat/>
+    <w:uiPriority w:val="0"/>
+    <w:rPr>
+      <w:sz w:val="21"/>
+      <w:szCs w:val="21"/>
+    </w:rPr>
+  </w:style>
+  <w:style w:type="paragraph" w:styleId="12">
     <w:name w:val="annotation text"/>
     <w:basedOn w:val="1"/>
     <w:link w:val="31"/>
-    <w:autoRedefine/>
     <w:qFormat/>
     <w:uiPriority w:val="0"/>
     <w:pPr>
@@ -4152,31 +5138,40 @@
       <w:szCs w:val="28"/>
     </w:rPr>
   </w:style>
-  <w:style w:type="paragraph" w:styleId="9">
-    <w:name w:val="toc 3"/>
-    <w:basedOn w:val="1"/>
-    <w:next w:val="1"/>
-    <w:qFormat/>
-    <w:uiPriority w:val="0"/>
-    <w:pPr>
-      <w:ind w:left="840" w:leftChars="400"/>
-    </w:pPr>
-  </w:style>
-  <w:style w:type="paragraph" w:styleId="10">
-    <w:name w:val="Balloon Text"/>
-    <w:basedOn w:val="1"/>
-    <w:link w:val="30"/>
-    <w:qFormat/>
-    <w:uiPriority w:val="0"/>
-    <w:rPr>
-      <w:sz w:val="18"/>
-      <w:szCs w:val="18"/>
-    </w:rPr>
-  </w:style>
-  <w:style w:type="paragraph" w:styleId="11">
+  <w:style w:type="paragraph" w:styleId="13">
+    <w:name w:val="annotation subject"/>
+    <w:basedOn w:val="12"/>
+    <w:next w:val="12"/>
+    <w:link w:val="32"/>
+    <w:qFormat/>
+    <w:uiPriority w:val="0"/>
+    <w:rPr>
+      <w:b/>
+      <w:bCs/>
+    </w:rPr>
+  </w:style>
+  <w:style w:type="character" w:styleId="14">
+    <w:name w:val="Emphasis"/>
+    <w:basedOn w:val="7"/>
+    <w:qFormat/>
+    <w:uiPriority w:val="0"/>
+    <w:rPr>
+      <w:i/>
+    </w:rPr>
+  </w:style>
+  <w:style w:type="character" w:styleId="15">
+    <w:name w:val="FollowedHyperlink"/>
+    <w:basedOn w:val="7"/>
+    <w:qFormat/>
+    <w:uiPriority w:val="0"/>
+    <w:rPr>
+      <w:color w:val="800080"/>
+      <w:u w:val="single"/>
+    </w:rPr>
+  </w:style>
+  <w:style w:type="paragraph" w:styleId="16">
     <w:name w:val="footer"/>
     <w:basedOn w:val="1"/>
-    <w:autoRedefine/>
     <w:qFormat/>
     <w:uiPriority w:val="0"/>
     <w:pPr>
@@ -4191,10 +5186,33 @@
       <w:sz w:val="18"/>
     </w:rPr>
   </w:style>
-  <w:style w:type="paragraph" w:styleId="12">
+  <w:style w:type="character" w:styleId="17">
+    <w:name w:val="footnote reference"/>
+    <w:basedOn w:val="7"/>
+    <w:qFormat/>
+    <w:uiPriority w:val="0"/>
+    <w:rPr>
+      <w:vertAlign w:val="superscript"/>
+    </w:rPr>
+  </w:style>
+  <w:style w:type="paragraph" w:styleId="18">
+    <w:name w:val="footnote text"/>
+    <w:basedOn w:val="1"/>
+    <w:link w:val="44"/>
+    <w:qFormat/>
+    <w:uiPriority w:val="0"/>
+    <w:pPr>
+      <w:snapToGrid w:val="0"/>
+      <w:jc w:val="left"/>
+    </w:pPr>
+    <w:rPr>
+      <w:sz w:val="18"/>
+      <w:szCs w:val="18"/>
+    </w:rPr>
+  </w:style>
+  <w:style w:type="paragraph" w:styleId="19">
     <w:name w:val="header"/>
     <w:basedOn w:val="1"/>
-    <w:autoRedefine/>
     <w:qFormat/>
     <w:uiPriority w:val="0"/>
     <w:pPr>
@@ -4214,39 +5232,27 @@
       <w:sz w:val="18"/>
     </w:rPr>
   </w:style>
-  <w:style w:type="paragraph" w:styleId="13">
-    <w:name w:val="toc 1"/>
-    <w:basedOn w:val="1"/>
-    <w:next w:val="1"/>
-    <w:qFormat/>
-    <w:uiPriority w:val="0"/>
-  </w:style>
-  <w:style w:type="paragraph" w:styleId="14">
-    <w:name w:val="footnote text"/>
-    <w:basedOn w:val="1"/>
-    <w:link w:val="44"/>
-    <w:qFormat/>
-    <w:uiPriority w:val="0"/>
-    <w:pPr>
-      <w:snapToGrid w:val="0"/>
-      <w:jc w:val="left"/>
-    </w:pPr>
-    <w:rPr>
-      <w:sz w:val="18"/>
-      <w:szCs w:val="18"/>
-    </w:rPr>
-  </w:style>
-  <w:style w:type="paragraph" w:styleId="15">
-    <w:name w:val="toc 2"/>
-    <w:basedOn w:val="1"/>
-    <w:next w:val="1"/>
-    <w:qFormat/>
-    <w:uiPriority w:val="0"/>
-    <w:pPr>
-      <w:ind w:left="420" w:leftChars="200"/>
-    </w:pPr>
-  </w:style>
-  <w:style w:type="paragraph" w:styleId="16">
+  <w:style w:type="character" w:styleId="20">
+    <w:name w:val="HTML Code"/>
+    <w:basedOn w:val="7"/>
+    <w:qFormat/>
+    <w:uiPriority w:val="0"/>
+    <w:rPr>
+      <w:rFonts w:ascii="Courier New" w:hAnsi="Courier New"/>
+      <w:sz w:val="20"/>
+    </w:rPr>
+  </w:style>
+  <w:style w:type="character" w:styleId="21">
+    <w:name w:val="Hyperlink"/>
+    <w:basedOn w:val="7"/>
+    <w:qFormat/>
+    <w:uiPriority w:val="0"/>
+    <w:rPr>
+      <w:color w:val="0000FF"/>
+      <w:u w:val="single"/>
+    </w:rPr>
+  </w:style>
+  <w:style w:type="paragraph" w:styleId="22">
     <w:name w:val="Normal (Web)"/>
     <w:basedOn w:val="1"/>
     <w:qFormat/>
@@ -4260,22 +5266,17 @@
       <w:kern w:val="0"/>
     </w:rPr>
   </w:style>
-  <w:style w:type="paragraph" w:styleId="17">
-    <w:name w:val="annotation subject"/>
-    <w:basedOn w:val="8"/>
-    <w:next w:val="8"/>
-    <w:link w:val="32"/>
-    <w:autoRedefine/>
-    <w:qFormat/>
-    <w:uiPriority w:val="0"/>
+  <w:style w:type="character" w:styleId="23">
+    <w:name w:val="Strong"/>
+    <w:basedOn w:val="7"/>
+    <w:qFormat/>
+    <w:uiPriority w:val="22"/>
     <w:rPr>
       <w:b/>
-      <w:bCs/>
-    </w:rPr>
-  </w:style>
-  <w:style w:type="table" w:styleId="19">
+    </w:rPr>
+  </w:style>
+  <w:style w:type="table" w:styleId="24">
     <w:name w:val="Table Grid"/>
-    <w:autoRedefine/>
     <w:qFormat/>
     <w:uiPriority w:val="0"/>
     <w:pPr>
@@ -4299,74 +5300,32 @@
       </w:tblCellMar>
     </w:tblPr>
   </w:style>
-  <w:style w:type="character" w:styleId="21">
-    <w:name w:val="Strong"/>
-    <w:basedOn w:val="20"/>
-    <w:qFormat/>
-    <w:uiPriority w:val="22"/>
-    <w:rPr>
-      <w:b/>
-    </w:rPr>
-  </w:style>
-  <w:style w:type="character" w:styleId="22">
-    <w:name w:val="FollowedHyperlink"/>
-    <w:basedOn w:val="20"/>
-    <w:qFormat/>
-    <w:uiPriority w:val="0"/>
-    <w:rPr>
-      <w:color w:val="800080"/>
-      <w:u w:val="single"/>
-    </w:rPr>
-  </w:style>
-  <w:style w:type="character" w:styleId="23">
-    <w:name w:val="Emphasis"/>
-    <w:basedOn w:val="20"/>
-    <w:qFormat/>
-    <w:uiPriority w:val="0"/>
-    <w:rPr>
-      <w:i/>
-    </w:rPr>
-  </w:style>
-  <w:style w:type="character" w:styleId="24">
-    <w:name w:val="Hyperlink"/>
-    <w:basedOn w:val="20"/>
-    <w:autoRedefine/>
-    <w:qFormat/>
-    <w:uiPriority w:val="0"/>
-    <w:rPr>
-      <w:color w:val="0000FF"/>
-      <w:u w:val="single"/>
-    </w:rPr>
-  </w:style>
-  <w:style w:type="character" w:styleId="25">
-    <w:name w:val="HTML Code"/>
-    <w:basedOn w:val="20"/>
-    <w:qFormat/>
-    <w:uiPriority w:val="0"/>
-    <w:rPr>
-      <w:rFonts w:ascii="Courier New" w:hAnsi="Courier New"/>
-      <w:sz w:val="20"/>
-    </w:rPr>
-  </w:style>
-  <w:style w:type="character" w:styleId="26">
-    <w:name w:val="annotation reference"/>
-    <w:basedOn w:val="20"/>
-    <w:autoRedefine/>
-    <w:qFormat/>
-    <w:uiPriority w:val="0"/>
-    <w:rPr>
-      <w:sz w:val="21"/>
-      <w:szCs w:val="21"/>
-    </w:rPr>
-  </w:style>
-  <w:style w:type="character" w:styleId="27">
-    <w:name w:val="footnote reference"/>
-    <w:basedOn w:val="20"/>
-    <w:qFormat/>
-    <w:uiPriority w:val="0"/>
-    <w:rPr>
-      <w:vertAlign w:val="superscript"/>
-    </w:rPr>
+  <w:style w:type="paragraph" w:styleId="25">
+    <w:name w:val="toc 1"/>
+    <w:basedOn w:val="1"/>
+    <w:next w:val="1"/>
+    <w:qFormat/>
+    <w:uiPriority w:val="0"/>
+  </w:style>
+  <w:style w:type="paragraph" w:styleId="26">
+    <w:name w:val="toc 2"/>
+    <w:basedOn w:val="1"/>
+    <w:next w:val="1"/>
+    <w:qFormat/>
+    <w:uiPriority w:val="0"/>
+    <w:pPr>
+      <w:ind w:left="420" w:leftChars="200"/>
+    </w:pPr>
+  </w:style>
+  <w:style w:type="paragraph" w:styleId="27">
+    <w:name w:val="toc 3"/>
+    <w:basedOn w:val="1"/>
+    <w:next w:val="1"/>
+    <w:qFormat/>
+    <w:uiPriority w:val="0"/>
+    <w:pPr>
+      <w:ind w:left="840" w:leftChars="400"/>
+    </w:pPr>
   </w:style>
   <w:style w:type="character" w:customStyle="1" w:styleId="28">
     <w:name w:val="标题 1 字符"/>
@@ -4398,9 +5357,8 @@
   </w:style>
   <w:style w:type="character" w:customStyle="1" w:styleId="30">
     <w:name w:val="批注框文本 字符"/>
-    <w:basedOn w:val="20"/>
-    <w:link w:val="10"/>
-    <w:autoRedefine/>
+    <w:basedOn w:val="7"/>
+    <w:link w:val="9"/>
     <w:qFormat/>
     <w:uiPriority w:val="0"/>
     <w:rPr>
@@ -4412,9 +5370,8 @@
   </w:style>
   <w:style w:type="character" w:customStyle="1" w:styleId="31">
     <w:name w:val="批注文字 字符"/>
-    <w:basedOn w:val="20"/>
-    <w:link w:val="8"/>
-    <w:autoRedefine/>
+    <w:basedOn w:val="7"/>
+    <w:link w:val="12"/>
     <w:qFormat/>
     <w:uiPriority w:val="0"/>
     <w:rPr>
@@ -4426,8 +5383,7 @@
   <w:style w:type="character" w:customStyle="1" w:styleId="32">
     <w:name w:val="批注主题 字符"/>
     <w:basedOn w:val="31"/>
-    <w:link w:val="17"/>
-    <w:autoRedefine/>
+    <w:link w:val="13"/>
     <w:qFormat/>
     <w:uiPriority w:val="0"/>
     <w:rPr>
@@ -4440,14 +5396,12 @@
   <w:style w:type="paragraph" w:customStyle="1" w:styleId="33">
     <w:name w:val="列出段落1"/>
     <w:basedOn w:val="1"/>
-    <w:autoRedefine/>
     <w:qFormat/>
     <w:uiPriority w:val="34"/>
   </w:style>
   <w:style w:type="paragraph" w:customStyle="1" w:styleId="34">
     <w:name w:val="2"/>
     <w:basedOn w:val="1"/>
-    <w:autoRedefine/>
     <w:qFormat/>
     <w:uiPriority w:val="0"/>
     <w:pPr>
@@ -4486,7 +5440,7 @@
   </w:style>
   <w:style w:type="character" w:customStyle="1" w:styleId="37">
     <w:name w:val="15"/>
-    <w:basedOn w:val="20"/>
+    <w:basedOn w:val="7"/>
     <w:qFormat/>
     <w:uiPriority w:val="0"/>
     <w:rPr>
@@ -4510,7 +5464,7 @@
   </w:style>
   <w:style w:type="character" w:customStyle="1" w:styleId="39">
     <w:name w:val="EndNote Bibliography Title 字符"/>
-    <w:basedOn w:val="20"/>
+    <w:basedOn w:val="7"/>
     <w:link w:val="38"/>
     <w:qFormat/>
     <w:uiPriority w:val="0"/>
@@ -4536,7 +5490,7 @@
   </w:style>
   <w:style w:type="character" w:customStyle="1" w:styleId="41">
     <w:name w:val="EndNote Bibliography 字符"/>
-    <w:basedOn w:val="20"/>
+    <w:basedOn w:val="7"/>
     <w:link w:val="40"/>
     <w:qFormat/>
     <w:uiPriority w:val="0"/>
@@ -4548,7 +5502,7 @@
   </w:style>
   <w:style w:type="character" w:customStyle="1" w:styleId="42">
     <w:name w:val="未处理的提及1"/>
-    <w:basedOn w:val="20"/>
+    <w:basedOn w:val="7"/>
     <w:semiHidden/>
     <w:unhideWhenUsed/>
     <w:qFormat/>
@@ -4560,7 +5514,7 @@
   </w:style>
   <w:style w:type="character" w:styleId="43">
     <w:name w:val="Placeholder Text"/>
-    <w:basedOn w:val="20"/>
+    <w:basedOn w:val="7"/>
     <w:unhideWhenUsed/>
     <w:qFormat/>
     <w:uiPriority w:val="99"/>
@@ -4570,8 +5524,8 @@
   </w:style>
   <w:style w:type="character" w:customStyle="1" w:styleId="44">
     <w:name w:val="脚注文本 字符"/>
-    <w:basedOn w:val="20"/>
-    <w:link w:val="14"/>
+    <w:basedOn w:val="7"/>
+    <w:link w:val="18"/>
     <w:qFormat/>
     <w:uiPriority w:val="0"/>
     <w:rPr>
@@ -4611,7 +5565,7 @@
   </w:style>
   <w:style w:type="character" w:customStyle="1" w:styleId="47">
     <w:name w:val="未处理的提及2"/>
-    <w:basedOn w:val="20"/>
+    <w:basedOn w:val="7"/>
     <w:semiHidden/>
     <w:unhideWhenUsed/>
     <w:qFormat/>
@@ -4651,7 +5605,7 @@
   </w:style>
   <w:style w:type="character" w:customStyle="1" w:styleId="50">
     <w:name w:val="标题 4 字符"/>
-    <w:basedOn w:val="20"/>
+    <w:basedOn w:val="7"/>
     <w:link w:val="6"/>
     <w:semiHidden/>
     <w:qFormat/>
@@ -4667,7 +5621,7 @@
   </w:style>
   <w:style w:type="character" w:customStyle="1" w:styleId="51">
     <w:name w:val="未处理的提及3"/>
-    <w:basedOn w:val="20"/>
+    <w:basedOn w:val="7"/>
     <w:semiHidden/>
     <w:unhideWhenUsed/>
     <w:qFormat/>
@@ -4727,7 +5681,7 @@
   </w:style>
   <w:style w:type="table" w:customStyle="1" w:styleId="55">
     <w:name w:val="清单表 3 - 着色 51"/>
-    <w:basedOn w:val="18"/>
+    <w:basedOn w:val="8"/>
     <w:qFormat/>
     <w:uiPriority w:val="48"/>
     <w:tblPr>
@@ -5158,7 +6112,8 @@
   </w:style>
   <w:style w:type="character" w:customStyle="1" w:styleId="89">
     <w:name w:val="red"/>
-    <w:basedOn w:val="20"/>
+    <w:basedOn w:val="7"/>
+    <w:qFormat/>
     <w:uiPriority w:val="0"/>
     <w:rPr>
       <w:rFonts w:ascii="Times New Roman" w:hAnsi="Times New Roman"/>
@@ -5427,6 +6382,7 @@
 <s:customData xmlns="http://www.wps.cn/officeDocument/2013/wpsCustomData" xmlns:s="http://www.wps.cn/officeDocument/2013/wpsCustomData">
   <customSectProps>
     <customSectPr/>
+    <customSectPr/>
   </customSectProps>
   <customShpExts>
     <customShpInfo spid="_x0000_s1026" textRotate="1"/>

</xml_diff>